<commit_message>
docs: complete the A2 report example and align documentation
Complete the instructor report example and update README, report guidance and submission checklists to describe its contents. Keep the student identity fields blank.
</commit_message>
<xml_diff>
--- a/report/PROG2002 A2 Report.docx
+++ b/report/PROG2002 A2 Report.docx
@@ -4,7 +4,7 @@
   <w:body>
     <w:p>
       <w:pPr>
-        <w:spacing w:line="360" w:lineRule="auto"/>
+        <w:spacing w:after="20" w:line="360" w:lineRule="auto"/>
         <w:ind w:left="-5"/>
         <w:jc w:val="center"/>
         <w:rPr>
@@ -18,36 +18,16 @@
         <w:rPr>
           <w:rFonts w:ascii="Arial" w:hAnsi="Arial"/>
           <w:b/>
-          <w:sz w:val="24"/>
-          <w:szCs w:val="28"/>
-          <w:u w:val="single" w:color="000000"/>
-        </w:rPr>
-        <w:t>PROG2002</w:t>
-      </w:r>
-      <w:r>
-        <w:rPr>
-          <w:rFonts w:ascii="Arial" w:hAnsi="Arial"/>
-          <w:b/>
-          <w:sz w:val="24"/>
-          <w:szCs w:val="28"/>
-          <w:u w:val="single" w:color="000000"/>
-        </w:rPr>
-        <w:t xml:space="preserve"> – </w:t>
-      </w:r>
-      <w:r>
-        <w:rPr>
-          <w:rFonts w:ascii="Arial" w:hAnsi="Arial"/>
-          <w:b/>
-          <w:sz w:val="24"/>
-          <w:szCs w:val="28"/>
-          <w:u w:val="single" w:color="000000"/>
-        </w:rPr>
-        <w:t>Web Development II</w:t>
-      </w:r>
-    </w:p>
-    <w:p>
-      <w:pPr>
-        <w:spacing w:line="360" w:lineRule="auto"/>
+          <w:color w:val="000000"/>
+          <w:sz w:val="24"/>
+          <w:u w:val="none"/>
+        </w:rPr>
+        <w:t>PROG2002 – Web Development II</w:t>
+      </w:r>
+    </w:p>
+    <w:p>
+      <w:pPr>
+        <w:spacing w:after="300" w:line="360" w:lineRule="auto"/>
         <w:ind w:left="-5"/>
         <w:jc w:val="center"/>
         <w:rPr>
@@ -61,152 +41,153 @@
         <w:rPr>
           <w:rFonts w:ascii="Arial" w:hAnsi="Arial"/>
           <w:b/>
-          <w:sz w:val="24"/>
-          <w:szCs w:val="28"/>
-          <w:u w:val="single" w:color="000000"/>
-        </w:rPr>
-        <w:t xml:space="preserve">Assignment </w:t>
-      </w:r>
-      <w:r>
-        <w:rPr>
-          <w:rFonts w:ascii="Arial" w:hAnsi="Arial"/>
-          <w:b/>
-          <w:sz w:val="24"/>
-          <w:szCs w:val="28"/>
-          <w:u w:val="single" w:color="000000"/>
-        </w:rPr>
-        <w:t>2</w:t>
-      </w:r>
-      <w:r>
-        <w:rPr>
-          <w:rFonts w:ascii="Arial" w:hAnsi="Arial"/>
-          <w:b/>
-          <w:sz w:val="24"/>
-          <w:szCs w:val="28"/>
-          <w:u w:val="single" w:color="000000"/>
-        </w:rPr>
-        <w:t xml:space="preserve">: </w:t>
-      </w:r>
-      <w:r>
-        <w:rPr>
-          <w:rFonts w:ascii="Arial" w:hAnsi="Arial"/>
-          <w:b/>
-          <w:sz w:val="24"/>
-          <w:szCs w:val="28"/>
-          <w:u w:val="single" w:color="000000"/>
-        </w:rPr>
-        <w:t xml:space="preserve">Use Case </w:t>
-      </w:r>
-      <w:r>
-        <w:rPr>
-          <w:rFonts w:ascii="Arial" w:hAnsi="Arial"/>
-          <w:b/>
-          <w:sz w:val="24"/>
-          <w:szCs w:val="28"/>
-          <w:u w:val="single" w:color="000000"/>
-        </w:rPr>
-        <w:t>(A Dynamic Website)</w:t>
-      </w:r>
-    </w:p>
-    <w:p>
-      <w:pPr>
+          <w:color w:val="000000"/>
+          <w:sz w:val="24"/>
+          <w:u w:val="none"/>
+        </w:rPr>
+        <w:t>Assignment 2: Use Case (A Dynamic Website)</w:t>
+      </w:r>
+    </w:p>
+    <w:p>
+      <w:pPr>
+        <w:tabs>
+          <w:tab w:pos="2952" w:val="left"/>
+          <w:tab w:pos="6048" w:val="left"/>
+        </w:tabs>
+        <w:spacing w:after="280" w:line="360" w:lineRule="auto"/>
+        <w:ind w:left="-6" w:hanging="11"/>
+        <w:rPr>
+          <w:rFonts w:ascii="Arial" w:hAnsi="Arial" w:cs="Arial"/>
+          <w:sz w:val="24"/>
+          <w:szCs w:val="24"/>
+        </w:rPr>
+      </w:pPr>
+      <w:r/>
+      <w:r>
+        <w:rPr>
+          <w:rFonts w:ascii="Arial" w:hAnsi="Arial"/>
+          <w:b/>
+          <w:color w:val="000000"/>
+          <w:sz w:val="24"/>
+          <w:u w:val="none"/>
+        </w:rPr>
+        <w:t>Student ID:</w:t>
+      </w:r>
+      <w:r>
+        <w:rPr>
+          <w:rFonts w:ascii="Arial" w:hAnsi="Arial"/>
+          <w:b/>
+          <w:color w:val="000000"/>
+          <w:sz w:val="24"/>
+          <w:u w:val="none"/>
+        </w:rPr>
+        <w:tab/>
+        <w:t>Last Name:</w:t>
+      </w:r>
+      <w:r>
+        <w:rPr>
+          <w:rFonts w:ascii="Arial" w:hAnsi="Arial"/>
+          <w:b/>
+          <w:color w:val="000000"/>
+          <w:sz w:val="24"/>
+          <w:u w:val="none"/>
+        </w:rPr>
+        <w:tab/>
+        <w:t>First Name:</w:t>
+      </w:r>
+    </w:p>
+    <w:p>
+      <w:pPr>
+        <w:spacing w:after="0" w:line="360" w:lineRule="auto"/>
+        <w:ind w:left="-6" w:hanging="11"/>
+        <w:rPr>
+          <w:rFonts w:ascii="Arial" w:hAnsi="Arial" w:cs="Arial"/>
+          <w:b/>
+          <w:sz w:val="24"/>
+          <w:szCs w:val="24"/>
+        </w:rPr>
+      </w:pPr>
+      <w:r>
+        <w:rPr>
+          <w:rFonts w:ascii="Arial" w:hAnsi="Arial"/>
+          <w:b/>
+          <w:color w:val="000000"/>
+          <w:sz w:val="24"/>
+          <w:u w:val="none"/>
+        </w:rPr>
+        <w:t>Title of the project:</w:t>
+      </w:r>
+    </w:p>
+    <w:p>
+      <w:pPr>
+        <w:pStyle w:val="Title"/>
+        <w:keepNext w:val="0"/>
+        <w:spacing w:line="360" w:lineRule="auto"/>
+      </w:pPr>
+      <w:r>
+        <w:rPr>
+          <w:rFonts w:ascii="Arial" w:hAnsi="Arial"/>
+          <w:color w:val="000000"/>
+          <w:sz w:val="24"/>
+          <w:u w:val="none"/>
+        </w:rPr>
+        <w:t>Sydney Community Giving charity events website</w:t>
+      </w:r>
+    </w:p>
+    <w:p>
+      <w:pPr>
+        <w:pStyle w:val="Heading1"/>
         <w:spacing w:after="120" w:line="360" w:lineRule="auto"/>
         <w:ind w:left="-6" w:hanging="11"/>
         <w:rPr>
           <w:rFonts w:ascii="Arial" w:hAnsi="Arial" w:cs="Arial"/>
+          <w:b/>
           <w:sz w:val="24"/>
           <w:szCs w:val="24"/>
         </w:rPr>
       </w:pPr>
       <w:r>
         <w:rPr>
-          <w:rFonts w:ascii="Arial" w:hAnsi="Arial" w:cs="Arial"/>
-          <w:b/>
-          <w:bCs/>
-          <w:sz w:val="24"/>
-          <w:szCs w:val="24"/>
-        </w:rPr>
-        <w:t>Student ID:</w:t>
-      </w:r>
-      <w:r>
-        <w:rPr>
-          <w:rFonts w:ascii="Arial" w:hAnsi="Arial" w:cs="Arial"/>
-          <w:sz w:val="24"/>
-          <w:szCs w:val="24"/>
-        </w:rPr>
-        <w:tab/>
-      </w:r>
-      <w:r>
-        <w:rPr>
-          <w:rFonts w:ascii="Arial" w:hAnsi="Arial" w:cs="Arial"/>
-          <w:sz w:val="24"/>
-          <w:szCs w:val="24"/>
-        </w:rPr>
-        <w:tab/>
-      </w:r>
-      <w:r>
-        <w:rPr>
-          <w:rFonts w:ascii="Arial" w:hAnsi="Arial" w:cs="Arial"/>
-          <w:sz w:val="24"/>
-          <w:szCs w:val="24"/>
-        </w:rPr>
-        <w:tab/>
-      </w:r>
-      <w:r>
-        <w:rPr>
-          <w:rFonts w:ascii="Arial" w:hAnsi="Arial" w:cs="Arial"/>
-          <w:b/>
-          <w:bCs/>
-          <w:sz w:val="24"/>
-          <w:szCs w:val="24"/>
-        </w:rPr>
-        <w:t>Last Name:</w:t>
-      </w:r>
-      <w:r>
-        <w:rPr>
-          <w:rFonts w:ascii="Arial" w:hAnsi="Arial" w:cs="Arial"/>
-          <w:sz w:val="24"/>
-          <w:szCs w:val="24"/>
-        </w:rPr>
-        <w:tab/>
-      </w:r>
-      <w:r>
-        <w:rPr>
-          <w:rFonts w:ascii="Arial" w:hAnsi="Arial" w:cs="Arial"/>
-          <w:sz w:val="24"/>
-          <w:szCs w:val="24"/>
-        </w:rPr>
-        <w:tab/>
-      </w:r>
-      <w:r>
-        <w:rPr>
-          <w:rFonts w:ascii="Arial" w:hAnsi="Arial" w:cs="Arial"/>
-          <w:sz w:val="24"/>
-          <w:szCs w:val="24"/>
-        </w:rPr>
-        <w:tab/>
-      </w:r>
-      <w:r>
-        <w:rPr>
-          <w:rFonts w:ascii="Arial" w:hAnsi="Arial" w:cs="Arial"/>
-          <w:b/>
-          <w:bCs/>
-          <w:sz w:val="24"/>
-          <w:szCs w:val="24"/>
-        </w:rPr>
-        <w:t>First Name:</w:t>
-      </w:r>
-      <w:r>
-        <w:rPr>
-          <w:rFonts w:ascii="Arial" w:hAnsi="Arial" w:cs="Arial"/>
-          <w:sz w:val="24"/>
-          <w:szCs w:val="24"/>
-        </w:rPr>
-        <w:t xml:space="preserve">  </w:t>
-      </w:r>
-    </w:p>
-    <w:p>
-      <w:pPr>
+          <w:rFonts w:ascii="Arial" w:hAnsi="Arial"/>
+          <w:b/>
+          <w:color w:val="000000"/>
+          <w:sz w:val="24"/>
+          <w:u w:val="none"/>
+        </w:rPr>
+        <w:t>Introduction/Motivation</w:t>
+      </w:r>
+    </w:p>
+    <w:p>
+      <w:pPr>
+        <w:spacing w:line="360" w:lineRule="auto"/>
+      </w:pPr>
+      <w:r>
+        <w:rPr>
+          <w:rFonts w:ascii="Arial" w:hAnsi="Arial"/>
+          <w:color w:val="000000"/>
+          <w:sz w:val="24"/>
+          <w:u w:val="none"/>
+        </w:rPr>
+        <w:t>Sydney Community Giving was created for this case study to list local fundraisers for food relief, youth mentoring, housing support and creative learning. The website gives visitors the date, suburb, ticket price and cause before they choose an event.</w:t>
+      </w:r>
+    </w:p>
+    <w:p>
+      <w:pPr>
+        <w:spacing w:line="360" w:lineRule="auto"/>
+      </w:pPr>
+      <w:r>
+        <w:rPr>
+          <w:rFonts w:ascii="Arial" w:hAnsi="Arial"/>
+          <w:color w:val="000000"/>
+          <w:sz w:val="24"/>
+          <w:u w:val="none"/>
+        </w:rPr>
+        <w:t>The sample calendar includes runs, a free makers market, concerts and dinners. These formats also allow the site to show both free and paid events clearly.</w:t>
+      </w:r>
+    </w:p>
+    <w:p>
+      <w:pPr>
+        <w:pStyle w:val="Heading1"/>
         <w:spacing w:after="120" w:line="360" w:lineRule="auto"/>
         <w:ind w:left="-6" w:hanging="11"/>
         <w:rPr>
@@ -218,16 +199,32 @@
       </w:pPr>
       <w:r>
         <w:rPr>
-          <w:rFonts w:ascii="Arial" w:hAnsi="Arial" w:cs="Arial"/>
-          <w:b/>
-          <w:sz w:val="24"/>
-          <w:szCs w:val="24"/>
-        </w:rPr>
-        <w:t xml:space="preserve">Title of the project: </w:t>
-      </w:r>
-    </w:p>
-    <w:p>
-      <w:pPr>
+          <w:rFonts w:ascii="Arial" w:hAnsi="Arial"/>
+          <w:b/>
+          <w:color w:val="000000"/>
+          <w:sz w:val="24"/>
+          <w:u w:val="none"/>
+        </w:rPr>
+        <w:t>Problem Statement</w:t>
+      </w:r>
+    </w:p>
+    <w:p>
+      <w:pPr>
+        <w:spacing w:line="360" w:lineRule="auto"/>
+      </w:pPr>
+      <w:r>
+        <w:rPr>
+          <w:rFonts w:ascii="Arial" w:hAnsi="Arial"/>
+          <w:color w:val="000000"/>
+          <w:sz w:val="24"/>
+          <w:u w:val="none"/>
+        </w:rPr>
+        <w:t>Event information loses value quickly. A finished run should not remain in an upcoming list, and a suspended concert should not be advertised. Visitors need to narrow the calendar by date, location or type, then open the correct event to see its schedule, venue, purpose, ticket information and fundraising progress. Ticket purchasing and account management are outside this version.</w:t>
+      </w:r>
+    </w:p>
+    <w:p>
+      <w:pPr>
+        <w:pStyle w:val="Heading1"/>
         <w:spacing w:after="120" w:line="360" w:lineRule="auto"/>
         <w:ind w:left="-6" w:hanging="11"/>
         <w:rPr>
@@ -239,25 +236,46 @@
       </w:pPr>
       <w:r>
         <w:rPr>
-          <w:rFonts w:ascii="Arial" w:hAnsi="Arial" w:cs="Arial"/>
-          <w:b/>
-          <w:sz w:val="24"/>
-          <w:szCs w:val="24"/>
-        </w:rPr>
-        <w:t>Introduction</w:t>
-      </w:r>
-      <w:r>
-        <w:rPr>
-          <w:rFonts w:ascii="Arial" w:hAnsi="Arial" w:cs="Arial"/>
-          <w:b/>
-          <w:sz w:val="24"/>
-          <w:szCs w:val="24"/>
-        </w:rPr>
-        <w:t>/Motivation</w:t>
-      </w:r>
-    </w:p>
-    <w:p>
-      <w:pPr>
+          <w:rFonts w:ascii="Arial" w:hAnsi="Arial"/>
+          <w:b/>
+          <w:color w:val="000000"/>
+          <w:sz w:val="24"/>
+          <w:u w:val="none"/>
+        </w:rPr>
+        <w:t>Solution</w:t>
+      </w:r>
+    </w:p>
+    <w:p>
+      <w:pPr>
+        <w:spacing w:line="360" w:lineRule="auto"/>
+      </w:pPr>
+      <w:r>
+        <w:rPr>
+          <w:rFonts w:ascii="Arial" w:hAnsi="Arial"/>
+          <w:color w:val="000000"/>
+          <w:sz w:val="24"/>
+          <w:u w:val="none"/>
+        </w:rPr>
+        <w:t>MySQL stores organisations, categories and events. A Node.js server uses Express to provide three read-only API routes and serve the pages and assets from the same origin. The event_db.js file creates a MySQL connection pool using credentials from environment variables. The browser does not connect directly to MySQL.</w:t>
+      </w:r>
+    </w:p>
+    <w:p>
+      <w:pPr>
+        <w:spacing w:line="360" w:lineRule="auto"/>
+      </w:pPr>
+      <w:r>
+        <w:rPr>
+          <w:rFonts w:ascii="Arial" w:hAnsi="Arial"/>
+          <w:color w:val="000000"/>
+          <w:sz w:val="24"/>
+          <w:u w:val="none"/>
+        </w:rPr>
+        <w:t>The home.js script builds event cards from /api/events. The search.js script loads categories and sends selected filters to that route. The event.js script reads the ID in event.html?id=... and requests /api/events/:id. Each script displays the JSON data with DOM methods. The detail page has a registration form. Pressing Register shows "This feature is currently under construction." No registration data is sent.</w:t>
+      </w:r>
+    </w:p>
+    <w:p>
+      <w:pPr>
+        <w:pStyle w:val="Heading1"/>
         <w:spacing w:after="120" w:line="360" w:lineRule="auto"/>
         <w:ind w:left="-6" w:hanging="11"/>
         <w:rPr>
@@ -269,25 +287,46 @@
       </w:pPr>
       <w:r>
         <w:rPr>
-          <w:rFonts w:ascii="Arial" w:hAnsi="Arial" w:cs="Arial"/>
-          <w:b/>
-          <w:sz w:val="24"/>
-          <w:szCs w:val="24"/>
-        </w:rPr>
-        <w:t xml:space="preserve">Problem </w:t>
-      </w:r>
-      <w:r>
-        <w:rPr>
-          <w:rFonts w:ascii="Arial" w:hAnsi="Arial" w:cs="Arial"/>
-          <w:b/>
-          <w:sz w:val="24"/>
-          <w:szCs w:val="24"/>
-        </w:rPr>
-        <w:t>Statement</w:t>
-      </w:r>
-    </w:p>
-    <w:p>
-      <w:pPr>
+          <w:rFonts w:ascii="Arial" w:hAnsi="Arial"/>
+          <w:b/>
+          <w:color w:val="000000"/>
+          <w:sz w:val="24"/>
+          <w:u w:val="none"/>
+        </w:rPr>
+        <w:t>Web UX</w:t>
+      </w:r>
+    </w:p>
+    <w:p>
+      <w:pPr>
+        <w:spacing w:line="360" w:lineRule="auto"/>
+      </w:pPr>
+      <w:r>
+        <w:rPr>
+          <w:rFonts w:ascii="Arial" w:hAnsi="Arial"/>
+          <w:color w:val="000000"/>
+          <w:sz w:val="24"/>
+          <w:u w:val="none"/>
+        </w:rPr>
+        <w:t>Home, Events and About appear in the navigation on every page. The home page presents the next event first and links each card to its detail page. On that page, the date, place, ticket price and organiser sit beside the description, cause and fundraising amounts.</w:t>
+      </w:r>
+    </w:p>
+    <w:p>
+      <w:pPr>
+        <w:spacing w:line="360" w:lineRule="auto"/>
+      </w:pPr>
+      <w:r>
+        <w:rPr>
+          <w:rFonts w:ascii="Arial" w:hAnsi="Arial"/>
+          <w:color w:val="000000"/>
+          <w:sz w:val="24"/>
+          <w:u w:val="none"/>
+        </w:rPr>
+        <w:t>The search form has a date input, a suburb or venue field, and an API-populated category selector. Visitors can use one field or several. Clear filters resets the controls and refreshes the results. A result count, an empty-state message and request-error text explain the outcome. At phone width the layout stacks into one column. Labels, visible keyboard focus, a skip link and live status messages support access by keyboard and assistive technology.</w:t>
+      </w:r>
+    </w:p>
+    <w:p>
+      <w:pPr>
+        <w:pStyle w:val="Heading1"/>
         <w:spacing w:after="120" w:line="360" w:lineRule="auto"/>
         <w:ind w:left="-6" w:hanging="11"/>
         <w:rPr>
@@ -299,36 +338,106 @@
       </w:pPr>
       <w:r>
         <w:rPr>
-          <w:rFonts w:ascii="Arial" w:hAnsi="Arial" w:cs="Arial"/>
-          <w:b/>
-          <w:sz w:val="24"/>
-          <w:szCs w:val="24"/>
-        </w:rPr>
-        <w:t xml:space="preserve">Solution </w:t>
-      </w:r>
-    </w:p>
-    <w:p>
-      <w:pPr>
+          <w:rFonts w:ascii="Arial" w:hAnsi="Arial"/>
+          <w:b/>
+          <w:color w:val="000000"/>
+          <w:sz w:val="24"/>
+          <w:u w:val="none"/>
+        </w:rPr>
+        <w:t>Data Schema</w:t>
+      </w:r>
+    </w:p>
+    <w:p>
+      <w:pPr>
+        <w:spacing w:line="360" w:lineRule="auto"/>
+      </w:pPr>
+      <w:r>
+        <w:rPr>
+          <w:rFonts w:ascii="Arial" w:hAnsi="Arial"/>
+          <w:color w:val="000000"/>
+          <w:sz w:val="24"/>
+          <w:u w:val="none"/>
+        </w:rPr>
+        <w:t>The charityevents_db database has three tables. One organisation can run many events, and one category can classify many events. Foreign keys on each event row require both referenced records to exist. Events also store the name, descriptions, date and times, venue, suburb, image filename, ticket price, fundraising amounts and suspension flag.</w:t>
+      </w:r>
+    </w:p>
+    <w:p>
+      <w:pPr>
+        <w:keepNext/>
+        <w:spacing w:after="20" w:line="360" w:lineRule="auto"/>
+        <w:jc w:val="center"/>
+      </w:pPr>
+      <w:r>
+        <w:drawing>
+          <wp:inline xmlns:a="http://schemas.openxmlformats.org/drawingml/2006/main" xmlns:pic="http://schemas.openxmlformats.org/drawingml/2006/picture">
+            <wp:extent cx="5623560" cy="1300448"/>
+            <wp:docPr id="1" name="Picture 1" descr="One organisation has many events and one category has many events. Events carries both foreign keys."/>
+            <wp:cNvGraphicFramePr>
+              <a:graphicFrameLocks noChangeAspect="1"/>
+            </wp:cNvGraphicFramePr>
+            <a:graphic>
+              <a:graphicData uri="http://schemas.openxmlformats.org/drawingml/2006/picture">
+                <pic:pic>
+                  <pic:nvPicPr>
+                    <pic:cNvPr id="0" name="report-relations.png"/>
+                    <pic:cNvPicPr/>
+                  </pic:nvPicPr>
+                  <pic:blipFill>
+                    <a:blip r:embed="rId7"/>
+                    <a:stretch>
+                      <a:fillRect/>
+                    </a:stretch>
+                  </pic:blipFill>
+                  <pic:spPr>
+                    <a:xfrm>
+                      <a:off x="0" y="0"/>
+                      <a:ext cx="5623560" cy="1300448"/>
+                    </a:xfrm>
+                    <a:prstGeom prst="rect"/>
+                  </pic:spPr>
+                </pic:pic>
+              </a:graphicData>
+            </a:graphic>
+          </wp:inline>
+        </w:drawing>
+      </w:r>
+    </w:p>
+    <w:p>
+      <w:pPr>
+        <w:spacing w:after="100" w:line="360" w:lineRule="auto"/>
+        <w:jc w:val="center"/>
+      </w:pPr>
+      <w:r>
+        <w:rPr>
+          <w:rFonts w:ascii="Arial" w:hAnsi="Arial"/>
+          <w:i/>
+          <w:color w:val="000000"/>
+          <w:sz w:val="24"/>
+          <w:u w:val="none"/>
+        </w:rPr>
+        <w:t>Figure 1. Relationships between organisations, events and categories</w:t>
+      </w:r>
+    </w:p>
+    <w:p>
+      <w:pPr>
+        <w:spacing w:line="360" w:lineRule="auto"/>
+      </w:pPr>
+      <w:r>
+        <w:rPr>
+          <w:rFonts w:ascii="Arial" w:hAnsi="Arial"/>
+          <w:color w:val="000000"/>
+          <w:sz w:val="24"/>
+          <w:u w:val="none"/>
+        </w:rPr>
+        <w:t>The import file creates four categories and ten sample events: eight upcoming public events, one past event and one suspended event. Dates are calculated from the day of import. SQL checks reject negative ticket prices, zero targets and end times before start times. Indexes support date, visibility and category lookups.</w:t>
+      </w:r>
+    </w:p>
+    <w:p>
+      <w:pPr>
+        <w:pStyle w:val="Heading1"/>
         <w:spacing w:after="120" w:line="360" w:lineRule="auto"/>
         <w:ind w:left="-6" w:hanging="11"/>
         <w:rPr>
-          <w:rStyle w:val="selected"/>
-        </w:rPr>
-      </w:pPr>
-      <w:r>
-        <w:rPr>
-          <w:rStyle w:val="selected"/>
-          <w:rFonts w:ascii="Arial" w:hAnsi="Arial"/>
-          <w:sz w:val="24"/>
-        </w:rPr>
-        <w:t>May relate to the client and server communication concept</w:t>
-      </w:r>
-    </w:p>
-    <w:p>
-      <w:pPr>
-        <w:spacing w:after="120" w:line="360" w:lineRule="auto"/>
-        <w:ind w:left="-6" w:hanging="11"/>
-        <w:rPr>
           <w:rFonts w:ascii="Arial" w:hAnsi="Arial" w:cs="Arial"/>
           <w:b/>
           <w:sz w:val="24"/>
@@ -337,232 +446,456 @@
       </w:pPr>
       <w:r>
         <w:rPr>
-          <w:rFonts w:ascii="Arial" w:hAnsi="Arial" w:cs="Arial"/>
-          <w:b/>
-          <w:sz w:val="24"/>
-          <w:szCs w:val="24"/>
-        </w:rPr>
-        <w:t>Web UX</w:t>
-      </w:r>
-    </w:p>
-    <w:p>
-      <w:pPr>
-        <w:spacing w:after="120" w:line="360" w:lineRule="auto"/>
-        <w:ind w:left="-6" w:hanging="11"/>
-        <w:rPr>
-          <w:rStyle w:val="selected"/>
-        </w:rPr>
-      </w:pPr>
-      <w:r>
-        <w:rPr>
-          <w:rStyle w:val="selected"/>
-          <w:rFonts w:ascii="Arial" w:hAnsi="Arial"/>
-          <w:sz w:val="24"/>
-        </w:rPr>
-        <w:t xml:space="preserve">How did you ensure the application is intuitive and easy to use? (e.g., wireframing, </w:t>
-      </w:r>
-      <w:r>
-        <w:rPr>
-          <w:rStyle w:val="selected"/>
-          <w:rFonts w:ascii="Arial" w:hAnsi="Arial"/>
-          <w:sz w:val="24"/>
-        </w:rPr>
-        <w:t>navigation</w:t>
-      </w:r>
-      <w:r>
-        <w:rPr>
-          <w:rStyle w:val="selected"/>
-          <w:rFonts w:ascii="Arial" w:hAnsi="Arial"/>
-          <w:sz w:val="24"/>
-        </w:rPr>
-        <w:t>).</w:t>
-      </w:r>
-    </w:p>
-    <w:p>
-      <w:pPr>
-        <w:spacing w:after="120" w:line="360" w:lineRule="auto"/>
-        <w:ind w:left="-6" w:hanging="11"/>
-        <w:rPr>
-          <w:rFonts w:ascii="Arial" w:hAnsi="Arial" w:cs="Arial"/>
-          <w:b/>
-          <w:sz w:val="24"/>
-          <w:szCs w:val="24"/>
-        </w:rPr>
-      </w:pPr>
-      <w:r>
-        <w:rPr>
-          <w:rFonts w:ascii="Arial" w:hAnsi="Arial" w:cs="Arial"/>
-          <w:b/>
-          <w:sz w:val="24"/>
-          <w:szCs w:val="24"/>
-        </w:rPr>
-        <w:t xml:space="preserve">Data Schema </w:t>
-      </w:r>
-    </w:p>
-    <w:p>
-      <w:pPr>
-        <w:spacing w:after="120" w:line="360" w:lineRule="auto"/>
-        <w:ind w:left="-6" w:hanging="11"/>
-        <w:rPr>
-          <w:rStyle w:val="selected"/>
-        </w:rPr>
-      </w:pPr>
-      <w:r>
-        <w:rPr>
-          <w:rStyle w:val="selected"/>
-          <w:rFonts w:ascii="Arial" w:hAnsi="Arial"/>
-          <w:sz w:val="24"/>
-        </w:rPr>
-        <w:t>Provide a high-level overview of your data model</w:t>
-      </w:r>
-      <w:r>
-        <w:rPr>
-          <w:rStyle w:val="selected"/>
-          <w:rFonts w:ascii="Arial" w:hAnsi="Arial"/>
-          <w:sz w:val="24"/>
-        </w:rPr>
-        <w:t xml:space="preserve"> including the relationship between entities.</w:t>
-      </w:r>
-    </w:p>
-    <w:p>
-      <w:pPr>
-        <w:spacing w:after="120" w:line="360" w:lineRule="auto"/>
-        <w:ind w:left="-6" w:hanging="11"/>
-        <w:rPr>
-          <w:rFonts w:ascii="Arial" w:hAnsi="Arial" w:cs="Arial"/>
-          <w:b/>
-          <w:sz w:val="24"/>
-          <w:szCs w:val="24"/>
-        </w:rPr>
-      </w:pPr>
-      <w:r>
-        <w:rPr>
-          <w:rFonts w:ascii="Arial" w:hAnsi="Arial" w:cs="Arial"/>
-          <w:b/>
-          <w:sz w:val="24"/>
-          <w:szCs w:val="24"/>
+          <w:rFonts w:ascii="Arial" w:hAnsi="Arial"/>
+          <w:b/>
+          <w:color w:val="000000"/>
+          <w:sz w:val="24"/>
+          <w:u w:val="none"/>
         </w:rPr>
         <w:t>API design</w:t>
       </w:r>
-      <w:r>
-        <w:rPr>
-          <w:rFonts w:ascii="Arial" w:hAnsi="Arial" w:cs="Arial"/>
-          <w:b/>
-          <w:sz w:val="24"/>
-          <w:szCs w:val="24"/>
-        </w:rPr>
-        <w:t xml:space="preserve"> </w:t>
-      </w:r>
-    </w:p>
-    <w:p>
-      <w:pPr>
-        <w:pStyle w:val="ListParagraph"/>
-        <w:numPr>
-          <w:ilvl w:val="0"/>
-          <w:numId w:val="1"/>
-        </w:numPr>
-        <w:spacing w:after="120" w:line="360" w:lineRule="auto"/>
-        <w:rPr>
-          <w:rStyle w:val="selected"/>
-        </w:rPr>
-      </w:pPr>
-      <w:r>
-        <w:rPr>
-          <w:rStyle w:val="selected"/>
-          <w:rFonts w:ascii="Arial" w:hAnsi="Arial"/>
-          <w:sz w:val="24"/>
-        </w:rPr>
-        <w:t xml:space="preserve">List the main API endpoints of your application (e.g., </w:t>
-      </w:r>
-      <w:r>
-        <w:rPr>
-          <w:rStyle w:val="selected"/>
-          <w:rFonts w:ascii="Arial" w:hAnsi="Arial"/>
-          <w:sz w:val="24"/>
-        </w:rPr>
-        <w:t>GET /api/users</w:t>
-      </w:r>
-      <w:r>
-        <w:rPr>
-          <w:rStyle w:val="selected"/>
-          <w:rFonts w:ascii="Arial" w:hAnsi="Arial"/>
-          <w:sz w:val="24"/>
-        </w:rPr>
-        <w:t xml:space="preserve">, </w:t>
-      </w:r>
-      <w:r>
-        <w:rPr>
-          <w:rStyle w:val="selected"/>
-          <w:rFonts w:ascii="Arial" w:hAnsi="Arial"/>
-          <w:sz w:val="24"/>
-        </w:rPr>
-        <w:t>POST /api/posts</w:t>
-      </w:r>
-      <w:r>
-        <w:rPr>
-          <w:rStyle w:val="selected"/>
-          <w:rFonts w:ascii="Arial" w:hAnsi="Arial"/>
-          <w:sz w:val="24"/>
-        </w:rPr>
-        <w:t>).</w:t>
-      </w:r>
-    </w:p>
-    <w:p>
-      <w:pPr>
-        <w:pStyle w:val="ListParagraph"/>
-        <w:numPr>
-          <w:ilvl w:val="0"/>
-          <w:numId w:val="1"/>
-        </w:numPr>
-        <w:spacing w:after="120" w:line="360" w:lineRule="auto"/>
-        <w:rPr>
-          <w:rStyle w:val="selected"/>
-        </w:rPr>
-      </w:pPr>
-      <w:r>
-        <w:rPr>
-          <w:rStyle w:val="selected"/>
-          <w:rFonts w:ascii="Arial" w:hAnsi="Arial"/>
-          <w:sz w:val="24"/>
-        </w:rPr>
-        <w:t xml:space="preserve">For a single </w:t>
-      </w:r>
-      <w:r>
-        <w:rPr>
-          <w:rStyle w:val="selected"/>
-          <w:rFonts w:ascii="Arial" w:hAnsi="Arial"/>
-          <w:sz w:val="24"/>
-        </w:rPr>
-        <w:t xml:space="preserve">API </w:t>
-      </w:r>
-      <w:r>
-        <w:rPr>
-          <w:rStyle w:val="selected"/>
-          <w:rFonts w:ascii="Arial" w:hAnsi="Arial"/>
-          <w:sz w:val="24"/>
-        </w:rPr>
-        <w:t>endpoint, describe its purpose, the data it expects to receive (request body), and the data it will return (response body).</w:t>
-      </w:r>
-    </w:p>
-    <w:p>
-      <w:pPr>
-        <w:pStyle w:val="ListParagraph"/>
-        <w:numPr>
-          <w:ilvl w:val="0"/>
-          <w:numId w:val="1"/>
-        </w:numPr>
-        <w:spacing w:after="120" w:line="360" w:lineRule="auto"/>
-        <w:rPr>
-          <w:rStyle w:val="selected"/>
-        </w:rPr>
-      </w:pPr>
-      <w:r>
-        <w:rPr>
-          <w:rStyle w:val="selected"/>
-          <w:rFonts w:ascii="Arial" w:hAnsi="Arial"/>
-          <w:sz w:val="24"/>
-        </w:rPr>
-        <w:t>Explain your choice of HTTP methods (GET, POST, PUT, DELETE, etc.) for each endpoint.</w:t>
+    </w:p>
+    <w:p>
+      <w:pPr>
+        <w:spacing w:line="360" w:lineRule="auto"/>
+      </w:pPr>
+      <w:r>
+        <w:rPr>
+          <w:rFonts w:ascii="Arial" w:hAnsi="Arial"/>
+          <w:color w:val="000000"/>
+          <w:sz w:val="24"/>
+          <w:u w:val="none"/>
+        </w:rPr>
+        <w:t>All three routes retrieve data, so each uses GET. The page scripts send no request body. Search values belong in the query string, while the event ID belongs in the detail route path.</w:t>
+      </w:r>
+    </w:p>
+    <w:tbl>
+      <w:tblPr>
+        <w:tblW w:type="auto" w:w="0"/>
+        <w:tblLayout w:type="fixed"/>
+        <w:tblLook w:firstColumn="1" w:firstRow="1" w:lastColumn="0" w:lastRow="0" w:noHBand="0" w:noVBand="1" w:val="04A0"/>
+      </w:tblPr>
+      <w:tblGrid>
+        <w:gridCol w:w="2448"/>
+        <w:gridCol w:w="3168"/>
+        <w:gridCol w:w="3384"/>
+      </w:tblGrid>
+      <w:tr>
+        <w:trPr>
+          <w:tblHeader/>
+        </w:trPr>
+        <w:tc>
+          <w:tcPr>
+            <w:tcW w:type="dxa" w:w="3009"/>
+            <w:vAlign w:val="center"/>
+            <w:tcBorders>
+              <w:top w:val="single" w:sz="4" w:color="B8C0C4"/>
+              <w:left w:val="single" w:sz="4" w:color="B8C0C4"/>
+              <w:bottom w:val="single" w:sz="4" w:color="B8C0C4"/>
+              <w:right w:val="single" w:sz="4" w:color="B8C0C4"/>
+            </w:tcBorders>
+            <w:shd w:fill="E9EDEF"/>
+          </w:tcPr>
+          <w:p>
+            <w:pPr>
+              <w:spacing w:line="360" w:lineRule="auto" w:after="0"/>
+            </w:pPr>
+            <w:r/>
+            <w:r>
+              <w:rPr>
+                <w:rFonts w:ascii="Arial" w:hAnsi="Arial"/>
+                <w:b/>
+                <w:color w:val="000000"/>
+                <w:sz w:val="24"/>
+                <w:u w:val="none"/>
+              </w:rPr>
+              <w:t>Route</w:t>
+            </w:r>
+          </w:p>
+        </w:tc>
+        <w:tc>
+          <w:tcPr>
+            <w:tcW w:type="dxa" w:w="3009"/>
+            <w:vAlign w:val="center"/>
+            <w:tcBorders>
+              <w:top w:val="single" w:sz="4" w:color="B8C0C4"/>
+              <w:left w:val="single" w:sz="4" w:color="B8C0C4"/>
+              <w:bottom w:val="single" w:sz="4" w:color="B8C0C4"/>
+              <w:right w:val="single" w:sz="4" w:color="B8C0C4"/>
+            </w:tcBorders>
+            <w:shd w:fill="E9EDEF"/>
+          </w:tcPr>
+          <w:p>
+            <w:pPr>
+              <w:spacing w:line="360" w:lineRule="auto" w:after="0"/>
+            </w:pPr>
+            <w:r/>
+            <w:r>
+              <w:rPr>
+                <w:rFonts w:ascii="Arial" w:hAnsi="Arial"/>
+                <w:b/>
+                <w:color w:val="000000"/>
+                <w:sz w:val="24"/>
+                <w:u w:val="none"/>
+              </w:rPr>
+              <w:t>Request</w:t>
+            </w:r>
+          </w:p>
+        </w:tc>
+        <w:tc>
+          <w:tcPr>
+            <w:tcW w:type="dxa" w:w="3009"/>
+            <w:vAlign w:val="center"/>
+            <w:tcBorders>
+              <w:top w:val="single" w:sz="4" w:color="B8C0C4"/>
+              <w:left w:val="single" w:sz="4" w:color="B8C0C4"/>
+              <w:bottom w:val="single" w:sz="4" w:color="B8C0C4"/>
+              <w:right w:val="single" w:sz="4" w:color="B8C0C4"/>
+            </w:tcBorders>
+            <w:shd w:fill="E9EDEF"/>
+          </w:tcPr>
+          <w:p>
+            <w:pPr>
+              <w:spacing w:line="360" w:lineRule="auto" w:after="0"/>
+            </w:pPr>
+            <w:r/>
+            <w:r>
+              <w:rPr>
+                <w:rFonts w:ascii="Arial" w:hAnsi="Arial"/>
+                <w:b/>
+                <w:color w:val="000000"/>
+                <w:sz w:val="24"/>
+                <w:u w:val="none"/>
+              </w:rPr>
+              <w:t>Successful response</w:t>
+            </w:r>
+          </w:p>
+        </w:tc>
+      </w:tr>
+      <w:tr>
+        <w:trPr>
+          <w:cantSplit/>
+        </w:trPr>
+        <w:tc>
+          <w:tcPr>
+            <w:tcW w:type="dxa" w:w="2448"/>
+            <w:vAlign w:val="center"/>
+            <w:tcBorders>
+              <w:top w:val="single" w:sz="4" w:color="B8C0C4"/>
+              <w:left w:val="single" w:sz="4" w:color="B8C0C4"/>
+              <w:bottom w:val="single" w:sz="4" w:color="B8C0C4"/>
+              <w:right w:val="single" w:sz="4" w:color="B8C0C4"/>
+            </w:tcBorders>
+          </w:tcPr>
+          <w:p>
+            <w:pPr>
+              <w:spacing w:line="360" w:lineRule="auto" w:after="0"/>
+            </w:pPr>
+            <w:r/>
+            <w:r>
+              <w:rPr>
+                <w:rFonts w:ascii="Arial" w:hAnsi="Arial"/>
+                <w:b w:val="0"/>
+                <w:color w:val="000000"/>
+                <w:sz w:val="24"/>
+                <w:u w:val="none"/>
+              </w:rPr>
+              <w:t>GET /api/events</w:t>
+            </w:r>
+          </w:p>
+        </w:tc>
+        <w:tc>
+          <w:tcPr>
+            <w:tcW w:type="dxa" w:w="3168"/>
+            <w:vAlign w:val="center"/>
+            <w:tcBorders>
+              <w:top w:val="single" w:sz="4" w:color="B8C0C4"/>
+              <w:left w:val="single" w:sz="4" w:color="B8C0C4"/>
+              <w:bottom w:val="single" w:sz="4" w:color="B8C0C4"/>
+              <w:right w:val="single" w:sz="4" w:color="B8C0C4"/>
+            </w:tcBorders>
+          </w:tcPr>
+          <w:p>
+            <w:pPr>
+              <w:spacing w:line="360" w:lineRule="auto" w:after="0"/>
+            </w:pPr>
+            <w:r/>
+            <w:r>
+              <w:rPr>
+                <w:rFonts w:ascii="Arial" w:hAnsi="Arial"/>
+                <w:b w:val="0"/>
+                <w:color w:val="000000"/>
+                <w:sz w:val="24"/>
+                <w:u w:val="none"/>
+              </w:rPr>
+              <w:t>Optional date, location and categoryId in the query; no body.</w:t>
+            </w:r>
+          </w:p>
+        </w:tc>
+        <w:tc>
+          <w:tcPr>
+            <w:tcW w:type="dxa" w:w="3384"/>
+            <w:vAlign w:val="center"/>
+            <w:tcBorders>
+              <w:top w:val="single" w:sz="4" w:color="B8C0C4"/>
+              <w:left w:val="single" w:sz="4" w:color="B8C0C4"/>
+              <w:bottom w:val="single" w:sz="4" w:color="B8C0C4"/>
+              <w:right w:val="single" w:sz="4" w:color="B8C0C4"/>
+            </w:tcBorders>
+          </w:tcPr>
+          <w:p>
+            <w:pPr>
+              <w:spacing w:line="360" w:lineRule="auto" w:after="0"/>
+            </w:pPr>
+            <w:r/>
+            <w:r>
+              <w:rPr>
+                <w:rFonts w:ascii="Arial" w:hAnsi="Arial"/>
+                <w:b w:val="0"/>
+                <w:color w:val="000000"/>
+                <w:sz w:val="24"/>
+                <w:u w:val="none"/>
+              </w:rPr>
+              <w:t>JSON event summaries in date order; no suspended or finished events.</w:t>
+            </w:r>
+          </w:p>
+        </w:tc>
+      </w:tr>
+      <w:tr>
+        <w:trPr>
+          <w:cantSplit/>
+        </w:trPr>
+        <w:tc>
+          <w:tcPr>
+            <w:tcW w:type="dxa" w:w="2448"/>
+            <w:vAlign w:val="center"/>
+            <w:tcBorders>
+              <w:top w:val="single" w:sz="4" w:color="B8C0C4"/>
+              <w:left w:val="single" w:sz="4" w:color="B8C0C4"/>
+              <w:bottom w:val="single" w:sz="4" w:color="B8C0C4"/>
+              <w:right w:val="single" w:sz="4" w:color="B8C0C4"/>
+            </w:tcBorders>
+          </w:tcPr>
+          <w:p>
+            <w:pPr>
+              <w:spacing w:line="360" w:lineRule="auto" w:after="0"/>
+            </w:pPr>
+            <w:r/>
+            <w:r>
+              <w:rPr>
+                <w:rFonts w:ascii="Arial" w:hAnsi="Arial"/>
+                <w:b w:val="0"/>
+                <w:color w:val="000000"/>
+                <w:sz w:val="24"/>
+                <w:u w:val="none"/>
+              </w:rPr>
+              <w:t>GET /api/categories</w:t>
+            </w:r>
+          </w:p>
+        </w:tc>
+        <w:tc>
+          <w:tcPr>
+            <w:tcW w:type="dxa" w:w="3168"/>
+            <w:vAlign w:val="center"/>
+            <w:tcBorders>
+              <w:top w:val="single" w:sz="4" w:color="B8C0C4"/>
+              <w:left w:val="single" w:sz="4" w:color="B8C0C4"/>
+              <w:bottom w:val="single" w:sz="4" w:color="B8C0C4"/>
+              <w:right w:val="single" w:sz="4" w:color="B8C0C4"/>
+            </w:tcBorders>
+          </w:tcPr>
+          <w:p>
+            <w:pPr>
+              <w:spacing w:line="360" w:lineRule="auto" w:after="0"/>
+            </w:pPr>
+            <w:r/>
+            <w:r>
+              <w:rPr>
+                <w:rFonts w:ascii="Arial" w:hAnsi="Arial"/>
+                <w:b w:val="0"/>
+                <w:color w:val="000000"/>
+                <w:sz w:val="24"/>
+                <w:u w:val="none"/>
+              </w:rPr>
+              <w:t>No parameters or body.</w:t>
+            </w:r>
+          </w:p>
+        </w:tc>
+        <w:tc>
+          <w:tcPr>
+            <w:tcW w:type="dxa" w:w="3384"/>
+            <w:vAlign w:val="center"/>
+            <w:tcBorders>
+              <w:top w:val="single" w:sz="4" w:color="B8C0C4"/>
+              <w:left w:val="single" w:sz="4" w:color="B8C0C4"/>
+              <w:bottom w:val="single" w:sz="4" w:color="B8C0C4"/>
+              <w:right w:val="single" w:sz="4" w:color="B8C0C4"/>
+            </w:tcBorders>
+          </w:tcPr>
+          <w:p>
+            <w:pPr>
+              <w:spacing w:line="360" w:lineRule="auto" w:after="0"/>
+            </w:pPr>
+            <w:r/>
+            <w:r>
+              <w:rPr>
+                <w:rFonts w:ascii="Arial" w:hAnsi="Arial"/>
+                <w:b w:val="0"/>
+                <w:color w:val="000000"/>
+                <w:sz w:val="24"/>
+                <w:u w:val="none"/>
+              </w:rPr>
+              <w:t>JSON array of category IDs and names.</w:t>
+            </w:r>
+          </w:p>
+        </w:tc>
+      </w:tr>
+      <w:tr>
+        <w:trPr>
+          <w:cantSplit/>
+        </w:trPr>
+        <w:tc>
+          <w:tcPr>
+            <w:tcW w:type="dxa" w:w="2448"/>
+            <w:vAlign w:val="center"/>
+            <w:tcBorders>
+              <w:top w:val="single" w:sz="4" w:color="B8C0C4"/>
+              <w:left w:val="single" w:sz="4" w:color="B8C0C4"/>
+              <w:bottom w:val="single" w:sz="4" w:color="B8C0C4"/>
+              <w:right w:val="single" w:sz="4" w:color="B8C0C4"/>
+            </w:tcBorders>
+          </w:tcPr>
+          <w:p>
+            <w:pPr>
+              <w:spacing w:line="360" w:lineRule="auto" w:after="0"/>
+            </w:pPr>
+            <w:r/>
+            <w:r>
+              <w:rPr>
+                <w:rFonts w:ascii="Arial" w:hAnsi="Arial"/>
+                <w:b w:val="0"/>
+                <w:color w:val="000000"/>
+                <w:sz w:val="24"/>
+                <w:u w:val="none"/>
+              </w:rPr>
+              <w:t>GET /api/events/:id</w:t>
+            </w:r>
+          </w:p>
+        </w:tc>
+        <w:tc>
+          <w:tcPr>
+            <w:tcW w:type="dxa" w:w="3168"/>
+            <w:vAlign w:val="center"/>
+            <w:tcBorders>
+              <w:top w:val="single" w:sz="4" w:color="B8C0C4"/>
+              <w:left w:val="single" w:sz="4" w:color="B8C0C4"/>
+              <w:bottom w:val="single" w:sz="4" w:color="B8C0C4"/>
+              <w:right w:val="single" w:sz="4" w:color="B8C0C4"/>
+            </w:tcBorders>
+          </w:tcPr>
+          <w:p>
+            <w:pPr>
+              <w:spacing w:line="360" w:lineRule="auto" w:after="0"/>
+            </w:pPr>
+            <w:r/>
+            <w:r>
+              <w:rPr>
+                <w:rFonts w:ascii="Arial" w:hAnsi="Arial"/>
+                <w:b w:val="0"/>
+                <w:color w:val="000000"/>
+                <w:sz w:val="24"/>
+                <w:u w:val="none"/>
+              </w:rPr>
+              <w:t>Positive event ID in the path; no body.</w:t>
+            </w:r>
+          </w:p>
+        </w:tc>
+        <w:tc>
+          <w:tcPr>
+            <w:tcW w:type="dxa" w:w="3384"/>
+            <w:vAlign w:val="center"/>
+            <w:tcBorders>
+              <w:top w:val="single" w:sz="4" w:color="B8C0C4"/>
+              <w:left w:val="single" w:sz="4" w:color="B8C0C4"/>
+              <w:bottom w:val="single" w:sz="4" w:color="B8C0C4"/>
+              <w:right w:val="single" w:sz="4" w:color="B8C0C4"/>
+            </w:tcBorders>
+          </w:tcPr>
+          <w:p>
+            <w:pPr>
+              <w:spacing w:line="360" w:lineRule="auto" w:after="0"/>
+            </w:pPr>
+            <w:r/>
+            <w:r>
+              <w:rPr>
+                <w:rFonts w:ascii="Arial" w:hAnsi="Arial"/>
+                <w:b w:val="0"/>
+                <w:color w:val="000000"/>
+                <w:sz w:val="24"/>
+                <w:u w:val="none"/>
+              </w:rPr>
+              <w:t>One JSON event with its full description, purpose and fundraising amounts.</w:t>
+            </w:r>
+          </w:p>
+        </w:tc>
+      </w:tr>
+    </w:tbl>
+    <w:p>
+      <w:pPr>
+        <w:spacing w:before="140" w:line="360" w:lineRule="auto"/>
+      </w:pPr>
+      <w:r>
+        <w:rPr>
+          <w:rFonts w:ascii="Arial" w:hAnsi="Arial"/>
+          <w:color w:val="000000"/>
+          <w:sz w:val="24"/>
+          <w:u w:val="none"/>
+        </w:rPr>
+        <w:t>For example, GET /api/events?location=Newtown&amp;categoryId=3 asks for Arts &amp; Music events in Newtown. While the sample concert is upcoming, the JSON array includes Enmore Benefit Night. Each result contains fields such as id, name, event_date, start_time, venue, suburb, ticket_price and category_name. Location is matched against venue, suburb and city.</w:t>
+      </w:r>
+    </w:p>
+    <w:p>
+      <w:pPr>
+        <w:spacing w:line="360" w:lineRule="auto"/>
+      </w:pPr>
+      <w:r>
+        <w:rPr>
+          <w:rFonts w:ascii="Arial" w:hAnsi="Arial"/>
+          <w:color w:val="000000"/>
+          <w:sz w:val="24"/>
+          <w:u w:val="none"/>
+        </w:rPr>
+        <w:t>The server validates dates and numeric IDs. Malformed values receive HTTP 400, an unknown or suspended detail ID receives 404, and a database failure receives 500. SQL placeholders hold user values, and the location search escapes LIKE wildcards. The list route excludes events whose end time has passed; the detail route excludes suspended events. POST, PUT and DELETE are reserved for later registration and administration work. The API smoke test covers filters, details and errors.</w:t>
+      </w:r>
+    </w:p>
+    <w:p>
+      <w:pPr>
+        <w:pStyle w:val="Heading1"/>
+        <w:spacing w:line="360" w:lineRule="auto"/>
+      </w:pPr>
+      <w:r>
+        <w:rPr>
+          <w:rFonts w:ascii="Arial" w:hAnsi="Arial"/>
+          <w:b/>
+          <w:color w:val="000000"/>
+          <w:sz w:val="24"/>
+          <w:u w:val="none"/>
+        </w:rPr>
+        <w:t>GenAI use declaration for this teaching example</w:t>
+      </w:r>
+    </w:p>
+    <w:p>
+      <w:pPr>
+        <w:spacing w:line="360" w:lineRule="auto"/>
+      </w:pPr>
+      <w:r>
+        <w:rPr>
+          <w:rFonts w:ascii="Arial" w:hAnsi="Arial"/>
+          <w:color w:val="000000"/>
+          <w:sz w:val="24"/>
+          <w:u w:val="none"/>
+        </w:rPr>
+        <w:t>OpenAI Codex was used to draft and format this instructor example. The identity fields above are intentionally blank. This declaration describes the example itself, not a student submission.</w:t>
       </w:r>
     </w:p>
     <w:sectPr>
@@ -1094,7 +1427,7 @@
     <w:name w:val="Normal"/>
     <w:qFormat/>
     <w:pPr>
-      <w:spacing w:after="159"/>
+      <w:spacing w:after="140" w:line="360" w:lineRule="auto"/>
       <w:ind w:left="10" w:hanging="10"/>
     </w:pPr>
     <w:rPr>
@@ -1163,6 +1496,31 @@
       <w:ind w:left="720"/>
       <w:contextualSpacing/>
     </w:pPr>
+  </w:style>
+  <w:style w:type="paragraph" w:customStyle="1" w:styleId="Heading1">
+    <w:name w:val="heading 1"/>
+    <w:pPr>
+      <w:keepNext/>
+      <w:spacing w:line="360" w:lineRule="auto" w:before="260" w:after="80"/>
+    </w:pPr>
+    <w:rPr>
+      <w:rFonts w:ascii="Arial" w:hAnsi="Arial"/>
+      <w:b/>
+      <w:color w:val="000000"/>
+      <w:sz w:val="24"/>
+    </w:rPr>
+  </w:style>
+  <w:style w:type="paragraph" w:customStyle="1" w:styleId="Title">
+    <w:name w:val="Title"/>
+    <w:pPr>
+      <w:spacing w:line="360" w:lineRule="auto" w:after="200"/>
+    </w:pPr>
+    <w:rPr>
+      <w:rFonts w:ascii="Arial" w:hAnsi="Arial"/>
+      <w:b/>
+      <w:color w:val="000000"/>
+      <w:sz w:val="24"/>
+    </w:rPr>
   </w:style>
 </w:styles>
 </file>

</xml_diff>

<commit_message>
docs: expand the A2 report and update submission guidance
Expand the Word report and update README, report guidance and requirement checklists. Revise the teaching-example labels in those documents.
</commit_message>
<xml_diff>
--- a/report/PROG2002 A2 Report.docx
+++ b/report/PROG2002 A2 Report.docx
@@ -168,21 +168,21 @@
           <w:sz w:val="24"/>
           <w:u w:val="none"/>
         </w:rPr>
-        <w:t>Sydney Community Giving was created for this case study to list local fundraisers for food relief, youth mentoring, housing support and creative learning. The website gives visitors the date, suburb, ticket price and cause before they choose an event.</w:t>
-      </w:r>
-    </w:p>
-    <w:p>
-      <w:pPr>
-        <w:spacing w:line="360" w:lineRule="auto"/>
-      </w:pPr>
-      <w:r>
-        <w:rPr>
-          <w:rFonts w:ascii="Arial" w:hAnsi="Arial"/>
-          <w:color w:val="000000"/>
-          <w:sz w:val="24"/>
-          <w:u w:val="none"/>
-        </w:rPr>
-        <w:t>The sample calendar includes runs, a free makers market, concerts and dinners. These formats also allow the site to show both free and paid events clearly.</w:t>
+        <w:t>Sydney Community Giving organises charity events across Sydney to raise money for food relief, youth mentoring, housing support and creative learning. The website gives people one calendar where they can check what is coming up, how much entry costs and what each event supports. Those details matter before someone travels to a venue or invites friends.</w:t>
+      </w:r>
+    </w:p>
+    <w:p>
+      <w:pPr>
+        <w:spacing w:line="360" w:lineRule="auto"/>
+      </w:pPr>
+      <w:r>
+        <w:rPr>
+          <w:rFonts w:ascii="Arial" w:hAnsi="Arial"/>
+          <w:color w:val="000000"/>
+          <w:sz w:val="24"/>
+          <w:u w:val="none"/>
+        </w:rPr>
+        <w:t>The calendar includes a harbour run, a free makers market at Carriageworks, music in Newtown and fundraising dinners. This range lets visitors consider several ways to take part while the site presents free and paid entry in a consistent way.</w:t>
       </w:r>
     </w:p>
     <w:p>
@@ -219,7 +219,21 @@
           <w:sz w:val="24"/>
           <w:u w:val="none"/>
         </w:rPr>
-        <w:t>Event information loses value quickly. A finished run should not remain in an upcoming list, and a suspended concert should not be advertised. Visitors need to narrow the calendar by date, location or type, then open the correct event to see its schedule, venue, purpose, ticket information and fundraising progress. Ticket purchasing and account management are outside this version.</w:t>
+        <w:t>A useful event list changes with time. Once a run ends, it should leave the public calendar. A suspended event must disappear even if its date is still in the future. Maintaining separate event details in static HTML would make those rules harder to apply consistently.</w:t>
+      </w:r>
+    </w:p>
+    <w:p>
+      <w:pPr>
+        <w:spacing w:line="360" w:lineRule="auto"/>
+      </w:pPr>
+      <w:r>
+        <w:rPr>
+          <w:rFonts w:ascii="Arial" w:hAnsi="Arial"/>
+          <w:color w:val="000000"/>
+          <w:sz w:val="24"/>
+          <w:u w:val="none"/>
+        </w:rPr>
+        <w:t>Visitors arrive with different constraints. Someone free on a particular day may search by date, while a person near Newtown may combine suburb and category. After finding a listing, they need the schedule, venue, cause, ticket information and fundraising progress. The website must support those tasks without suggesting that online registration or payment already works.</w:t>
       </w:r>
     </w:p>
     <w:p>
@@ -256,21 +270,35 @@
           <w:sz w:val="24"/>
           <w:u w:val="none"/>
         </w:rPr>
-        <w:t>MySQL stores organisations, categories and events. A Node.js server uses Express to provide three read-only API routes and serve the pages and assets from the same origin. The event_db.js file creates a MySQL connection pool using credentials from environment variables. The browser does not connect directly to MySQL.</w:t>
-      </w:r>
-    </w:p>
-    <w:p>
-      <w:pPr>
-        <w:spacing w:line="360" w:lineRule="auto"/>
-      </w:pPr>
-      <w:r>
-        <w:rPr>
-          <w:rFonts w:ascii="Arial" w:hAnsi="Arial"/>
-          <w:color w:val="000000"/>
-          <w:sz w:val="24"/>
-          <w:u w:val="none"/>
-        </w:rPr>
-        <w:t>The home.js script builds event cards from /api/events. The search.js script loads categories and sends selected filters to that route. The event.js script reads the ID in event.html?id=... and requests /api/events/:id. Each script displays the JSON data with DOM methods. The detail page has a registration form. Pressing Register shows "This feature is currently under construction." No registration data is sent.</w:t>
+        <w:t>MySQL stores organisations, categories and events. A Node.js/Express server serves the pages and read-only API. The event_db.js module opens a connection pool with database credentials from environment variables.</w:t>
+      </w:r>
+    </w:p>
+    <w:p>
+      <w:pPr>
+        <w:spacing w:line="360" w:lineRule="auto"/>
+      </w:pPr>
+      <w:r>
+        <w:rPr>
+          <w:rFonts w:ascii="Arial" w:hAnsi="Arial"/>
+          <w:color w:val="000000"/>
+          <w:sz w:val="24"/>
+          <w:u w:val="none"/>
+        </w:rPr>
+        <w:t>The home.js script requests /api/events and builds the featured event and remaining cards from the JSON response. On the search page, search.js first loads /api/categories. It then sends the chosen date, location and category as query parameters to /api/events. The detail page reads the ID from event.html?id=... and requests /api/events/:id. Serving the pages and API from one Express origin keeps those requests straightforward.</w:t>
+      </w:r>
+    </w:p>
+    <w:p>
+      <w:pPr>
+        <w:spacing w:line="360" w:lineRule="auto"/>
+      </w:pPr>
+      <w:r>
+        <w:rPr>
+          <w:rFonts w:ascii="Arial" w:hAnsi="Arial"/>
+          <w:color w:val="000000"/>
+          <w:sz w:val="24"/>
+          <w:u w:val="none"/>
+        </w:rPr>
+        <w:t>The shared requestJSON function uses fetch, checks the HTTP status and reports network or malformed-response errors. Event cards are built with DOM methods and textContent. On the search page, a request counter stops an older response from replacing newer results if a visitor searches twice in quick succession. The detail page displays a registration form, but pressing Register only shows "This feature is currently under construction." No name, email or ticket choice is sent to the server.</w:t>
       </w:r>
     </w:p>
     <w:p>
@@ -307,21 +335,35 @@
           <w:sz w:val="24"/>
           <w:u w:val="none"/>
         </w:rPr>
-        <w:t>Home, Events and About appear in the navigation on every page. The home page presents the next event first and links each card to its detail page. On that page, the date, place, ticket price and organiser sit beside the description, cause and fundraising amounts.</w:t>
-      </w:r>
-    </w:p>
-    <w:p>
-      <w:pPr>
-        <w:spacing w:line="360" w:lineRule="auto"/>
-      </w:pPr>
-      <w:r>
-        <w:rPr>
-          <w:rFonts w:ascii="Arial" w:hAnsi="Arial"/>
-          <w:color w:val="000000"/>
-          <w:sz w:val="24"/>
-          <w:u w:val="none"/>
-        </w:rPr>
-        <w:t>The search form has a date input, a suburb or venue field, and an API-populated category selector. Visitors can use one field or several. Clear filters resets the controls and refreshes the results. A result count, an empty-state message and request-error text explain the outcome. At phone width the layout stacks into one column. Labels, visible keyboard focus, a skip link and live status messages support access by keyboard and assistive technology.</w:t>
+        <w:t>Home, Events and About appear in every page’s navigation. The home page introduces the organisation, gives the next event a larger card and places other events below it. Cards show date, suburb, category, price and a short description, and link to the detail page. About explains the causes for visitors who want more context.</w:t>
+      </w:r>
+    </w:p>
+    <w:p>
+      <w:pPr>
+        <w:spacing w:line="360" w:lineRule="auto"/>
+      </w:pPr>
+      <w:r>
+        <w:rPr>
+          <w:rFonts w:ascii="Arial" w:hAnsi="Arial"/>
+          <w:color w:val="000000"/>
+          <w:sz w:val="24"/>
+          <w:u w:val="none"/>
+        </w:rPr>
+        <w:t>The search form has a native date input, a venue or suburb field and an API-fed category selector. Each filter works alone or with the others. Clear filters resets all fields and reloads the public list. The result count confirms a search; separate messages cover no matches, a failed request and unavailable categories.</w:t>
+      </w:r>
+    </w:p>
+    <w:p>
+      <w:pPr>
+        <w:spacing w:line="360" w:lineRule="auto"/>
+      </w:pPr>
+      <w:r>
+        <w:rPr>
+          <w:rFonts w:ascii="Arial" w:hAnsi="Arial"/>
+          <w:color w:val="000000"/>
+          <w:sz w:val="24"/>
+          <w:u w:val="none"/>
+        </w:rPr>
+        <w:t>On the detail page, schedule, venue, ticket price and organiser sit beside description and purpose. Free events say Free. Raised and target amounts appear as numbers, a bar and a text percentage. Columns stack on phones; labels, a skip link, visible focus and live status messages support keyboard use.</w:t>
       </w:r>
     </w:p>
     <w:p>
@@ -358,7 +400,21 @@
           <w:sz w:val="24"/>
           <w:u w:val="none"/>
         </w:rPr>
-        <w:t>The charityevents_db database has three tables. One organisation can run many events, and one category can classify many events. Foreign keys on each event row require both referenced records to exist. Events also store the name, descriptions, date and times, venue, suburb, image filename, ticket price, fundraising amounts and suspension flag.</w:t>
+        <w:t>The database has organisations, categories and events. Each table has an integer primary key. Events has foreign keys to the other two, forming two one-to-many relationships. Category names are unique.</w:t>
+      </w:r>
+    </w:p>
+    <w:p>
+      <w:pPr>
+        <w:spacing w:line="360" w:lineRule="auto"/>
+      </w:pPr>
+      <w:r>
+        <w:rPr>
+          <w:rFonts w:ascii="Arial" w:hAnsi="Arial"/>
+          <w:color w:val="000000"/>
+          <w:sz w:val="24"/>
+          <w:u w:val="none"/>
+        </w:rPr>
+        <w:t>An event stores its name, short and full descriptions, purpose, local date and start and end times, venue, suburb, city, image filename, ticket price, fundraising goal, amount raised and suspension flag. Ticket and fundraising values use DECIMAL columns so they are stored as monetary amounts. The image filename selects a local asset without duplicating the image in the database.</w:t>
       </w:r>
     </w:p>
     <w:p>
@@ -429,7 +485,35 @@
           <w:sz w:val="24"/>
           <w:u w:val="none"/>
         </w:rPr>
-        <w:t>The import file creates four categories and ten sample events: eight upcoming public events, one past event and one suspended event. Dates are calculated from the day of import. SQL checks reject negative ticket prices, zero targets and end times before start times. Indexes support date, visibility and category lookups.</w:t>
+        <w:t>The SQL file inserts one organisation, four categories and ten events. Eight are public and scheduled after import, one has already finished, and one is suspended. Their dates are calculated from the day the SQL is imported, so the public list can be demonstrated after a fresh setup. The past and suspended records also check the visibility rules.</w:t>
+      </w:r>
+    </w:p>
+    <w:p>
+      <w:pPr>
+        <w:spacing w:line="360" w:lineRule="auto"/>
+      </w:pPr>
+      <w:r>
+        <w:rPr>
+          <w:rFonts w:ascii="Arial" w:hAnsi="Arial"/>
+          <w:color w:val="000000"/>
+          <w:sz w:val="24"/>
+          <w:u w:val="none"/>
+        </w:rPr>
+        <w:t>Database checks require an end time after the start time, a non-negative ticket price, a positive goal and a non-negative amount raised. Indexes support the visibility and date check and the category filter. The server also formats the current time for Australia/Sydney before deciding which events belong in public listings.</w:t>
+      </w:r>
+    </w:p>
+    <w:p>
+      <w:pPr>
+        <w:spacing w:line="360" w:lineRule="auto"/>
+      </w:pPr>
+      <w:r>
+        <w:rPr>
+          <w:rFonts w:ascii="Arial" w:hAnsi="Arial"/>
+          <w:color w:val="000000"/>
+          <w:sz w:val="24"/>
+          <w:u w:val="none"/>
+        </w:rPr>
+        <w:t>Keeping organisations and categories in separate tables avoids copying their names into every event. The API joins those tables to events, so cards and detail pages receive the organiser and category labels from one source.</w:t>
       </w:r>
     </w:p>
     <w:p>
@@ -466,7 +550,10 @@
           <w:sz w:val="24"/>
           <w:u w:val="none"/>
         </w:rPr>
-        <w:t>All three routes retrieve data, so each uses GET. The page scripts send no request body. Search values belong in the query string, while the event ID belongs in the detail route path.</w:t>
+        <w:t>The API exposes events and categories as resources. All three routes retrieve data, so each uses GET and has no request body. Search terms are optional query parameters; the detail route takes the event ID in its path. Express returns JSON rather than HTML so the page scripts can decide how to display each result.</w:t>
+      </w:r>
+      <w:r>
+        <w:br w:type="page"/>
       </w:r>
     </w:p>
     <w:tbl>
@@ -628,7 +715,7 @@
                 <w:sz w:val="24"/>
                 <w:u w:val="none"/>
               </w:rPr>
-              <w:t>Optional date, location and categoryId in the query; no body.</w:t>
+              <w:t>Optional date, location and categoryId query values; no body.</w:t>
             </w:r>
           </w:p>
         </w:tc>
@@ -656,7 +743,7 @@
                 <w:sz w:val="24"/>
                 <w:u w:val="none"/>
               </w:rPr>
-              <w:t>JSON event summaries in date order; no suspended or finished events.</w:t>
+              <w:t>JSON summaries of unfinished, non-suspended events in date order.</w:t>
             </w:r>
           </w:p>
         </w:tc>
@@ -745,7 +832,7 @@
                 <w:sz w:val="24"/>
                 <w:u w:val="none"/>
               </w:rPr>
-              <w:t>JSON array of category IDs and names.</w:t>
+              <w:t>JSON array of category IDs and names, ordered by name.</w:t>
             </w:r>
           </w:p>
         </w:tc>
@@ -834,7 +921,7 @@
                 <w:sz w:val="24"/>
                 <w:u w:val="none"/>
               </w:rPr>
-              <w:t>One JSON event with its full description, purpose and fundraising amounts.</w:t>
+              <w:t>One JSON event with its full description, purpose, price, goal and raised amount.</w:t>
             </w:r>
           </w:p>
         </w:tc>
@@ -851,21 +938,35 @@
           <w:sz w:val="24"/>
           <w:u w:val="none"/>
         </w:rPr>
-        <w:t>For example, GET /api/events?location=Newtown&amp;categoryId=3 asks for Arts &amp; Music events in Newtown. While the sample concert is upcoming, the JSON array includes Enmore Benefit Night. Each result contains fields such as id, name, event_date, start_time, venue, suburb, ticket_price and category_name. Location is matched against venue, suburb and city.</w:t>
-      </w:r>
-    </w:p>
-    <w:p>
-      <w:pPr>
-        <w:spacing w:line="360" w:lineRule="auto"/>
-      </w:pPr>
-      <w:r>
-        <w:rPr>
-          <w:rFonts w:ascii="Arial" w:hAnsi="Arial"/>
-          <w:color w:val="000000"/>
-          <w:sz w:val="24"/>
-          <w:u w:val="none"/>
-        </w:rPr>
-        <w:t>The server validates dates and numeric IDs. Malformed values receive HTTP 400, an unknown or suspended detail ID receives 404, and a database failure receives 500. SQL placeholders hold user values, and the location search escapes LIKE wildcards. The list route excludes events whose end time has passed; the detail route excludes suspended events. POST, PUT and DELETE are reserved for later registration and administration work. The API smoke test covers filters, details and errors.</w:t>
+        <w:t>For example, GET /api/events?location=Newtown&amp;categoryId=3 requests Arts &amp; Music events in Newtown. It has no request body. While Enmore Benefit Night remains upcoming, the JSON array includes its ID, name, date, venue, ticket price and category, among other summary fields. The server searches venue, suburb and city for the location term.</w:t>
+      </w:r>
+    </w:p>
+    <w:p>
+      <w:pPr>
+        <w:spacing w:line="360" w:lineRule="auto"/>
+      </w:pPr>
+      <w:r>
+        <w:rPr>
+          <w:rFonts w:ascii="Arial" w:hAnsi="Arial"/>
+          <w:color w:val="000000"/>
+          <w:sz w:val="24"/>
+          <w:u w:val="none"/>
+        </w:rPr>
+        <w:t>The event list excludes suspended records and events whose end time has passed in Sydney. Its date, location and category conditions are combined with AND, so adding a filter narrows the results. The detail route excludes suspended events and adds the full description, purpose and fundraising figures to the summary fields. A finished but unsuspended event can still be retrieved directly by ID, though it no longer appears in the public list.</w:t>
+      </w:r>
+    </w:p>
+    <w:p>
+      <w:pPr>
+        <w:spacing w:line="360" w:lineRule="auto"/>
+      </w:pPr>
+      <w:r>
+        <w:rPr>
+          <w:rFonts w:ascii="Arial" w:hAnsi="Arial"/>
+          <w:color w:val="000000"/>
+          <w:sz w:val="24"/>
+          <w:u w:val="none"/>
+        </w:rPr>
+        <w:t>The server rejects invalid YYYY-MM-DD dates, locations over 100 characters and non-positive IDs with HTTP 400. Query values use SQL placeholders; LIKE wildcard characters are escaped in location searches. Unknown or suspended details return 404, and database failures return 500. POST, PUT and DELETE are outside this version because registration and administration do not write data. The smoke test checks filters, details and error responses.</w:t>
       </w:r>
     </w:p>
     <w:p>
@@ -881,21 +982,21 @@
           <w:sz w:val="24"/>
           <w:u w:val="none"/>
         </w:rPr>
-        <w:t>GenAI use declaration for this teaching example</w:t>
-      </w:r>
-    </w:p>
-    <w:p>
-      <w:pPr>
-        <w:spacing w:line="360" w:lineRule="auto"/>
-      </w:pPr>
-      <w:r>
-        <w:rPr>
-          <w:rFonts w:ascii="Arial" w:hAnsi="Arial"/>
-          <w:color w:val="000000"/>
-          <w:sz w:val="24"/>
-          <w:u w:val="none"/>
-        </w:rPr>
-        <w:t>OpenAI Codex was used to draft and format this instructor example. The identity fields above are intentionally blank. This declaration describes the example itself, not a student submission.</w:t>
+        <w:t>GenAI use declaration</w:t>
+      </w:r>
+    </w:p>
+    <w:p>
+      <w:pPr>
+        <w:spacing w:line="360" w:lineRule="auto"/>
+      </w:pPr>
+      <w:r>
+        <w:rPr>
+          <w:rFonts w:ascii="Arial" w:hAnsi="Arial"/>
+          <w:color w:val="000000"/>
+          <w:sz w:val="24"/>
+          <w:u w:val="none"/>
+        </w:rPr>
+        <w:t>I acknowledge that I have used GenAI tools to complete this assessment. I used OpenAI Codex to draft and format this report.</w:t>
       </w:r>
     </w:p>
     <w:sectPr>

</xml_diff>

<commit_message>
docs: move the AI declaration into a separate text file
Move the AI declaration from the report to report/GenAI Use Declaration.txt. Update the report and submission checklists and remove the superseded declaration guide.
</commit_message>
<xml_diff>
--- a/report/PROG2002 A2 Report.docx
+++ b/report/PROG2002 A2 Report.docx
@@ -967,36 +967,6 @@
           <w:u w:val="none"/>
         </w:rPr>
         <w:t>The server rejects invalid YYYY-MM-DD dates, locations over 100 characters and non-positive IDs with HTTP 400. Query values use SQL placeholders; LIKE wildcard characters are escaped in location searches. Unknown or suspended details return 404, and database failures return 500. POST, PUT and DELETE are outside this version because registration and administration do not write data. The smoke test checks filters, details and error responses.</w:t>
-      </w:r>
-    </w:p>
-    <w:p>
-      <w:pPr>
-        <w:pStyle w:val="Heading1"/>
-        <w:spacing w:line="360" w:lineRule="auto"/>
-      </w:pPr>
-      <w:r>
-        <w:rPr>
-          <w:rFonts w:ascii="Arial" w:hAnsi="Arial"/>
-          <w:b/>
-          <w:color w:val="000000"/>
-          <w:sz w:val="24"/>
-          <w:u w:val="none"/>
-        </w:rPr>
-        <w:t>GenAI use declaration</w:t>
-      </w:r>
-    </w:p>
-    <w:p>
-      <w:pPr>
-        <w:spacing w:line="360" w:lineRule="auto"/>
-      </w:pPr>
-      <w:r>
-        <w:rPr>
-          <w:rFonts w:ascii="Arial" w:hAnsi="Arial"/>
-          <w:color w:val="000000"/>
-          <w:sz w:val="24"/>
-          <w:u w:val="none"/>
-        </w:rPr>
-        <w:t>I acknowledge that I have used GenAI tools to complete this assessment. I used OpenAI Codex to brainstorm ideas, generate website code, draft this report and format the document. The code and report drafting exceed the permitted GenAI uses for student submissions in the Assessment Brief.</w:t>
       </w:r>
     </w:p>
     <w:sectPr>

</xml_diff>